<commit_message>
Ajoute la version anglaise du manuel projet et la note VC++ Redistributable
- docs/PROJECT_MANUAL.md + docs/Project_Manual_Shot_Classifier.docx :
  traduction complete du manuel operationnel (17 sections).
- docs/MANUEL_PROJET.md + .docx (FR) et field_app/README.md : ajoutent une
  note sur le Microsoft Visual C++ Redistributable, requis par PyTorch/
  scikit-learn dans l'exe empaquete, non teste sur une tablette "vierge".
- README (FR/EN) : lien croise entre les deux versions du manuel.
</commit_message>
<xml_diff>
--- a/docs/Manuel_Projet_Shot_Classifier.docx
+++ b/docs/Manuel_Projet_Shot_Classifier.docx
@@ -4082,7 +4082,7 @@
     </w:p>
     <w:bookmarkEnd w:id="36"/>
     <w:bookmarkEnd w:id="37"/>
-    <w:bookmarkStart w:id="45" w:name="X5e0e87f8d00dabaf3df25c90a2376fd8506e1f8"/>
+    <w:bookmarkStart w:id="46" w:name="X5e0e87f8d00dabaf3df25c90a2376fd8506e1f8"/>
     <w:p>
       <w:pPr>
         <w:pStyle w:val="Heading1"/>
@@ -4469,7 +4469,7 @@
       </w:r>
     </w:p>
     <w:bookmarkEnd w:id="40"/>
-    <w:bookmarkStart w:id="41" w:name="construire-lexécutable-windows-autonome"/>
+    <w:bookmarkStart w:id="42" w:name="construire-lexécutable-windows-autonome"/>
     <w:p>
       <w:pPr>
         <w:pStyle w:val="Heading2"/>
@@ -4737,8 +4737,86 @@
         <w:t xml:space="preserve">uniquement (pas iPad, pas Android, pas garanti sur Windows ARM).</w:t>
       </w:r>
     </w:p>
-    <w:bookmarkEnd w:id="41"/>
-    <w:bookmarkStart w:id="42" w:name="mise-en-réseau-avec-le-raspberry-pi"/>
+    <w:p>
+      <w:pPr>
+        <w:pStyle w:val="BlockText"/>
+      </w:pPr>
+      <w:r>
+        <w:rPr>
+          <w:b/>
+          <w:bCs/>
+          <w:lang w:val="fr"/>
+        </w:rPr>
+        <w:t xml:space="preserve">Prérequis sur la tablette cible, testé uniquement sur la machine de développement.</w:t>
+      </w:r>
+      <w:r>
+        <w:rPr>
+          <w:lang w:val="fr"/>
+        </w:rPr>
+        <w:t xml:space="preserve"> </w:t>
+      </w:r>
+      <w:r>
+        <w:rPr>
+          <w:lang w:val="fr"/>
+        </w:rPr>
+        <w:t xml:space="preserve">PyTorch et les autres bibliothèques natives embarquées ont généralement besoin du</w:t>
+      </w:r>
+      <w:r>
+        <w:rPr>
+          <w:lang w:val="fr"/>
+        </w:rPr>
+        <w:t xml:space="preserve"> </w:t>
+      </w:r>
+      <w:r>
+        <w:rPr>
+          <w:b/>
+          <w:bCs/>
+          <w:lang w:val="fr"/>
+        </w:rPr>
+        <w:t xml:space="preserve">Microsoft Visual C++ Redistributable</w:t>
+      </w:r>
+      <w:r>
+        <w:rPr>
+          <w:lang w:val="fr"/>
+        </w:rPr>
+        <w:t xml:space="preserve"> </w:t>
+      </w:r>
+      <w:r>
+        <w:rPr>
+          <w:lang w:val="fr"/>
+        </w:rPr>
+        <w:t xml:space="preserve">(2015-2022) présent sur le système. La plupart des Windows 10/11 récents l’ont déjà (installé par Windows Update), mais ce n’est pas garanti sur une tablette jamais mise à jour. Si l’exe refuse de démarrer (erreur de DLL manquante), l’installer résout le problème :</w:t>
+      </w:r>
+      <w:r>
+        <w:rPr>
+          <w:lang w:val="fr"/>
+        </w:rPr>
+        <w:t xml:space="preserve"> </w:t>
+      </w:r>
+      <w:hyperlink r:id="rId41">
+        <w:r>
+          <w:rPr>
+            <w:rStyle w:val="Hyperlink"/>
+            <w:lang w:val="fr"/>
+          </w:rPr>
+          <w:t xml:space="preserve">https://aka.ms/vs/17/release/vc_redist.x64.exe</w:t>
+        </w:r>
+      </w:hyperlink>
+      <w:r>
+        <w:rPr>
+          <w:lang w:val="fr"/>
+        </w:rPr>
+        <w:t xml:space="preserve"> </w:t>
+      </w:r>
+      <w:r>
+        <w:rPr>
+          <w:lang w:val="fr"/>
+        </w:rPr>
+        <w:t xml:space="preserve">(gratuit, ~15 Mo, une seule fois).</w:t>
+      </w:r>
+    </w:p>
+    <w:bookmarkEnd w:id="42"/>
+    <w:bookmarkStart w:id="43" w:name="mise-en-réseau-avec-le-raspberry-pi"/>
     <w:p>
       <w:pPr>
         <w:pStyle w:val="Heading2"/>
@@ -5275,8 +5353,8 @@
         <w:t xml:space="preserve">: la tablette peut diffuser son propre point d’accès mobile (Paramètres → Réseau et Internet → Point d’accès mobile) ; le RPi s’y connecte directement.</w:t>
       </w:r>
     </w:p>
-    <w:bookmarkEnd w:id="42"/>
-    <w:bookmarkStart w:id="43" w:name="tester-sans-capteur-panneau-test-manuel"/>
+    <w:bookmarkEnd w:id="43"/>
+    <w:bookmarkStart w:id="44" w:name="tester-sans-capteur-panneau-test-manuel"/>
     <w:p>
       <w:pPr>
         <w:pStyle w:val="Heading2"/>
@@ -5455,8 +5533,8 @@
         <w:t xml:space="preserve">Un sélecteur permet de choisir quelle cible simuler.</w:t>
       </w:r>
     </w:p>
-    <w:bookmarkEnd w:id="43"/>
-    <w:bookmarkStart w:id="44" w:name="X5497fc54ab13237740c5d6a94992630a05cce76"/>
+    <w:bookmarkEnd w:id="44"/>
+    <w:bookmarkStart w:id="45" w:name="X5497fc54ab13237740c5d6a94992630a05cce76"/>
     <w:p>
       <w:pPr>
         <w:pStyle w:val="Heading2"/>
@@ -5751,9 +5829,9 @@
         </w:pict>
       </w:r>
     </w:p>
-    <w:bookmarkEnd w:id="44"/>
     <w:bookmarkEnd w:id="45"/>
-    <w:bookmarkStart w:id="46" w:name="script-denvoi-raspberry-pi-rpi_sender"/>
+    <w:bookmarkEnd w:id="46"/>
+    <w:bookmarkStart w:id="47" w:name="script-denvoi-raspberry-pi-rpi_sender"/>
     <w:p>
       <w:pPr>
         <w:pStyle w:val="Heading1"/>
@@ -6094,8 +6172,8 @@
         </w:pict>
       </w:r>
     </w:p>
-    <w:bookmarkEnd w:id="46"/>
-    <w:bookmarkStart w:id="47" w:name="cicd"/>
+    <w:bookmarkEnd w:id="47"/>
+    <w:bookmarkStart w:id="48" w:name="cicd"/>
     <w:p>
       <w:pPr>
         <w:pStyle w:val="Heading1"/>
@@ -6312,8 +6390,8 @@
         </w:pict>
       </w:r>
     </w:p>
-    <w:bookmarkEnd w:id="47"/>
-    <w:bookmarkStart w:id="48" w:name="structure-du-dépôt"/>
+    <w:bookmarkEnd w:id="48"/>
+    <w:bookmarkStart w:id="49" w:name="structure-du-dépôt"/>
     <w:p>
       <w:pPr>
         <w:pStyle w:val="Heading1"/>
@@ -6634,8 +6712,8 @@
         </w:pict>
       </w:r>
     </w:p>
-    <w:bookmarkEnd w:id="48"/>
-    <w:bookmarkStart w:id="49" w:name="X62e6bc93baf43c8cd11e4a8f8aab6a98c1a1736"/>
+    <w:bookmarkEnd w:id="49"/>
+    <w:bookmarkStart w:id="50" w:name="X62e6bc93baf43c8cd11e4a8f8aab6a98c1a1736"/>
     <w:p>
       <w:pPr>
         <w:pStyle w:val="Heading1"/>
@@ -6850,8 +6928,8 @@
         </w:pict>
       </w:r>
     </w:p>
-    <w:bookmarkEnd w:id="49"/>
-    <w:bookmarkStart w:id="50" w:name="limites-connues-du-projet"/>
+    <w:bookmarkEnd w:id="50"/>
+    <w:bookmarkStart w:id="51" w:name="limites-connues-du-projet"/>
     <w:p>
       <w:pPr>
         <w:pStyle w:val="Heading1"/>
@@ -7004,8 +7082,8 @@
         </w:pict>
       </w:r>
     </w:p>
-    <w:bookmarkEnd w:id="50"/>
-    <w:bookmarkStart w:id="51" w:name="X90cf48057834cc906ee2d5cd74c83d530c98f98"/>
+    <w:bookmarkEnd w:id="51"/>
+    <w:bookmarkStart w:id="52" w:name="X90cf48057834cc906ee2d5cd74c83d530c98f98"/>
     <w:p>
       <w:pPr>
         <w:pStyle w:val="Heading1"/>
@@ -7471,8 +7549,8 @@
         </w:pict>
       </w:r>
     </w:p>
-    <w:bookmarkEnd w:id="51"/>
-    <w:bookmarkStart w:id="54" w:name="référence-rapide-commandes-et-ports"/>
+    <w:bookmarkEnd w:id="52"/>
+    <w:bookmarkStart w:id="55" w:name="référence-rapide-commandes-et-ports"/>
     <w:p>
       <w:pPr>
         <w:pStyle w:val="Heading1"/>
@@ -7484,7 +7562,7 @@
         <w:t xml:space="preserve">17. Référence rapide — commandes et ports</w:t>
       </w:r>
     </w:p>
-    <w:bookmarkStart w:id="52" w:name="commandes-essentielles"/>
+    <w:bookmarkStart w:id="53" w:name="commandes-essentielles"/>
     <w:p>
       <w:pPr>
         <w:pStyle w:val="Heading2"/>
@@ -7693,8 +7771,8 @@
         <w:t xml:space="preserve"># un cycle d'agent manuel</w:t>
       </w:r>
     </w:p>
-    <w:bookmarkEnd w:id="52"/>
-    <w:bookmarkStart w:id="53" w:name="ports-utilisés"/>
+    <w:bookmarkEnd w:id="53"/>
+    <w:bookmarkStart w:id="54" w:name="ports-utilisés"/>
     <w:p>
       <w:pPr>
         <w:pStyle w:val="Heading2"/>
@@ -8003,8 +8081,8 @@
         <w:t xml:space="preserve">.</w:t>
       </w:r>
     </w:p>
-    <w:bookmarkEnd w:id="53"/>
     <w:bookmarkEnd w:id="54"/>
+    <w:bookmarkEnd w:id="55"/>
     <w:sectPr>
       <w:footnotePr>
         <w:numRestart w:val="eachSect"/>

</xml_diff>

<commit_message>
Renforce l'avertissement sur le mot de passe Grafana par defaut
admin/admin (defaut universel de Grafana, pas un secret propre au
projet) etait mentionne comme simple fait ; reformule en avertissement
explicite (a changer immediatement) dans les deux manuels (FR/EN, .md et
.docx), suite a une question legitime sur l'utilite d'ecrire des
identifiants dans un document destine a un depot public.
</commit_message>
<xml_diff>
--- a/docs/Manuel_Projet_Shot_Classifier.docx
+++ b/docs/Manuel_Projet_Shot_Classifier.docx
@@ -2246,7 +2246,27 @@
               <w:rPr>
                 <w:lang w:val="fr"/>
               </w:rPr>
-              <w:t xml:space="preserve">(change de mot de passe demandé à la première connexion admin)</w:t>
+              <w:t xml:space="preserve">— ⚠️</w:t>
+            </w:r>
+            <w:r>
+              <w:rPr>
+                <w:lang w:val="fr"/>
+              </w:rPr>
+              <w:t xml:space="preserve"> </w:t>
+            </w:r>
+            <w:r>
+              <w:rPr>
+                <w:b/>
+                <w:bCs/>
+                <w:lang w:val="fr"/>
+              </w:rPr>
+              <w:t xml:space="preserve">à changer immédiatement</w:t>
+            </w:r>
+            <w:r>
+              <w:rPr>
+                <w:lang w:val="fr"/>
+              </w:rPr>
+              <w:t xml:space="preserve">, voir ci-dessous</w:t>
             </w:r>
           </w:p>
         </w:tc>
@@ -2262,19 +2282,91 @@
           <w:bCs/>
           <w:lang w:val="fr"/>
         </w:rPr>
-        <w:t xml:space="preserve">Sécurité.</w:t>
-      </w:r>
-      <w:r>
-        <w:rPr>
-          <w:lang w:val="fr"/>
-        </w:rPr>
-        <w:t xml:space="preserve"> </w:t>
-      </w:r>
-      <w:r>
-        <w:rPr>
-          <w:lang w:val="fr"/>
-        </w:rPr>
-        <w:t xml:space="preserve">Aucun de ces services n’a de protection robuste par mot de passe — c’est voulu pour un usage 100 % local. Ne jamais exposer ces ports sur internet sans revoir cette configuration (changer le mot de passe Grafana, désactiver l’accès anonyme, ajouter une authentification Prometheus).</w:t>
+        <w:t xml:space="preserve">⚠️ Sécurité — ne pas laisser tel quel.</w:t>
+      </w:r>
+      <w:r>
+        <w:rPr>
+          <w:lang w:val="fr"/>
+        </w:rPr>
+        <w:t xml:space="preserve"> </w:t>
+      </w:r>
+      <w:r>
+        <w:rPr>
+          <w:rStyle w:val="VerbatimChar"/>
+          <w:lang w:val="fr"/>
+        </w:rPr>
+        <w:t xml:space="preserve">admin</w:t>
+      </w:r>
+      <w:r>
+        <w:rPr>
+          <w:lang w:val="fr"/>
+        </w:rPr>
+        <w:t xml:space="preserve">/</w:t>
+      </w:r>
+      <w:r>
+        <w:rPr>
+          <w:rStyle w:val="VerbatimChar"/>
+          <w:lang w:val="fr"/>
+        </w:rPr>
+        <w:t xml:space="preserve">admin</w:t>
+      </w:r>
+      <w:r>
+        <w:rPr>
+          <w:lang w:val="fr"/>
+        </w:rPr>
+        <w:t xml:space="preserve"> </w:t>
+      </w:r>
+      <w:r>
+        <w:rPr>
+          <w:lang w:val="fr"/>
+        </w:rPr>
+        <w:t xml:space="preserve">est le mot de passe</w:t>
+      </w:r>
+      <w:r>
+        <w:rPr>
+          <w:lang w:val="fr"/>
+        </w:rPr>
+        <w:t xml:space="preserve"> </w:t>
+      </w:r>
+      <w:r>
+        <w:rPr>
+          <w:b/>
+          <w:bCs/>
+          <w:lang w:val="fr"/>
+        </w:rPr>
+        <w:t xml:space="preserve">par défaut de Grafana</w:t>
+      </w:r>
+      <w:r>
+        <w:rPr>
+          <w:lang w:val="fr"/>
+        </w:rPr>
+        <w:t xml:space="preserve">, identique pour toute installation dans le monde — ce n’est pas un secret propre à ce projet, mais le laisser tel quel rend le compte administrateur trivialement accessible à quiconque atteint le port 3000. Grafana impose de le changer à la première connexion admin ; ne pas ignorer cette étape. Plus généralement, aucun des services de cette pile n’a de protection robuste par mot de passe — c’est voulu pour un usage 100 % local.</w:t>
+      </w:r>
+      <w:r>
+        <w:rPr>
+          <w:lang w:val="fr"/>
+        </w:rPr>
+        <w:t xml:space="preserve"> </w:t>
+      </w:r>
+      <w:r>
+        <w:rPr>
+          <w:b/>
+          <w:bCs/>
+          <w:lang w:val="fr"/>
+        </w:rPr>
+        <w:t xml:space="preserve">Ne jamais exposer ces ports sur internet</w:t>
+      </w:r>
+      <w:r>
+        <w:rPr>
+          <w:lang w:val="fr"/>
+        </w:rPr>
+        <w:t xml:space="preserve"> </w:t>
+      </w:r>
+      <w:r>
+        <w:rPr>
+          <w:lang w:val="fr"/>
+        </w:rPr>
+        <w:t xml:space="preserve">sans revoir cette configuration (changer le mot de passe Grafana, désactiver l’accès anonyme, ajouter une authentification Prometheus).</w:t>
       </w:r>
     </w:p>
     <w:p>

</xml_diff>

<commit_message>
Synchronise les deux manuels (FR/EN) avec le pont TCP et le correctif agent
Les manuels n'avaient pas ete mis a jour depuis l'ajout de tcp_bridge.py :
- Nouvelle section 11.2 (FR et EN) : pont TCP pour plusieurs capteurs,
  IP fixe du RPi (192.168.0.255), protocole confirme avec le technicien
  (port 9090, plusieurs messages par connexion avec longueur prefixee,
  identification par IP source, detection brut/image).
- Point 8 ajoute a la section "Pieges rencontres" : le conteneur agent
  affichait "unhealthy" a tort (heritait du healthcheck Streamlit du
  Dockerfile), corrige avec un healthcheck dedie sur son /metrics.
- Les deux .docx regeneres en consequence.
</commit_message>
<xml_diff>
--- a/docs/Manuel_Projet_Shot_Classifier.docx
+++ b/docs/Manuel_Projet_Shot_Classifier.docx
@@ -5923,7 +5923,7 @@
     </w:p>
     <w:bookmarkEnd w:id="45"/>
     <w:bookmarkEnd w:id="46"/>
-    <w:bookmarkStart w:id="47" w:name="script-denvoi-raspberry-pi-rpi_sender"/>
+    <w:bookmarkStart w:id="49" w:name="scripts-côté-raspberry-pi-rpi_sender"/>
     <w:p>
       <w:pPr>
         <w:pStyle w:val="Heading1"/>
@@ -5932,7 +5932,7 @@
         <w:rPr>
           <w:lang w:val="fr"/>
         </w:rPr>
-        <w:t xml:space="preserve">11. Script d’envoi Raspberry Pi (</w:t>
+        <w:t xml:space="preserve">11. Scripts côté Raspberry Pi (</w:t>
       </w:r>
       <w:r>
         <w:rPr>
@@ -5946,6 +5946,54 @@
           <w:lang w:val="fr"/>
         </w:rPr>
         <w:t xml:space="preserve">)</w:t>
+      </w:r>
+    </w:p>
+    <w:p>
+      <w:pPr>
+        <w:pStyle w:val="FirstParagraph"/>
+      </w:pPr>
+      <w:r>
+        <w:rPr>
+          <w:lang w:val="fr"/>
+        </w:rPr>
+        <w:t xml:space="preserve">Deux scripts, selon comment les capteurs livrent leurs données.</w:t>
+      </w:r>
+    </w:p>
+    <w:bookmarkStart w:id="47" w:name="Xcb8dcfa9ca4aa92012c94280d1f4d992bf9b017"/>
+    <w:p>
+      <w:pPr>
+        <w:pStyle w:val="Heading2"/>
+      </w:pPr>
+      <w:r>
+        <w:rPr>
+          <w:lang w:val="fr"/>
+        </w:rPr>
+        <w:t xml:space="preserve">11.1</w:t>
+      </w:r>
+      <w:r>
+        <w:rPr>
+          <w:lang w:val="fr"/>
+        </w:rPr>
+        <w:t xml:space="preserve"> </w:t>
+      </w:r>
+      <w:r>
+        <w:rPr>
+          <w:rStyle w:val="VerbatimChar"/>
+          <w:lang w:val="fr"/>
+        </w:rPr>
+        <w:t xml:space="preserve">send_waveform.py</w:t>
+      </w:r>
+      <w:r>
+        <w:rPr>
+          <w:lang w:val="fr"/>
+        </w:rPr>
+        <w:t xml:space="preserve"> </w:t>
+      </w:r>
+      <w:r>
+        <w:rPr>
+          <w:lang w:val="fr"/>
+        </w:rPr>
+        <w:t xml:space="preserve">— un capteur lu directement sur ce RPi</w:t>
       </w:r>
     </w:p>
     <w:p>
@@ -6177,15 +6225,459 @@
         <w:t xml:space="preserve">est un point d’intégration à compléter avec la lecture matérielle réelle du capteur (ADC, GPIO, port série) — ce dépôt ne contient pas le code d’acquisition d’origine, seulement le pipeline de classification à partir de formes d’onde déjà capturées.</w:t>
       </w:r>
     </w:p>
+    <w:bookmarkEnd w:id="47"/>
+    <w:bookmarkStart w:id="48" w:name="X006b4fae02cef2633887da45fae9ab5a2c6d16b"/>
+    <w:p>
+      <w:pPr>
+        <w:pStyle w:val="Heading2"/>
+      </w:pPr>
+      <w:r>
+        <w:rPr>
+          <w:lang w:val="fr"/>
+        </w:rPr>
+        <w:t xml:space="preserve">11.2</w:t>
+      </w:r>
+      <w:r>
+        <w:rPr>
+          <w:lang w:val="fr"/>
+        </w:rPr>
+        <w:t xml:space="preserve"> </w:t>
+      </w:r>
+      <w:r>
+        <w:rPr>
+          <w:rStyle w:val="VerbatimChar"/>
+          <w:lang w:val="fr"/>
+        </w:rPr>
+        <w:t xml:space="preserve">tcp_bridge.py</w:t>
+      </w:r>
+      <w:r>
+        <w:rPr>
+          <w:lang w:val="fr"/>
+        </w:rPr>
+        <w:t xml:space="preserve"> </w:t>
+      </w:r>
+      <w:r>
+        <w:rPr>
+          <w:lang w:val="fr"/>
+        </w:rPr>
+        <w:t xml:space="preserve">— plusieurs capteurs relayés par le réseau</w:t>
+      </w:r>
+    </w:p>
+    <w:p>
+      <w:pPr>
+        <w:pStyle w:val="FirstParagraph"/>
+      </w:pPr>
+      <w:r>
+        <w:rPr>
+          <w:lang w:val="fr"/>
+        </w:rPr>
+        <w:t xml:space="preserve">Pour le cas réel de ce projet : chaque capteur est relié à son propre boîtier de contrôle à IP fixe (probablement un automate Siemens LOGO! 8), qui envoie ses données par</w:t>
+      </w:r>
+      <w:r>
+        <w:rPr>
+          <w:lang w:val="fr"/>
+        </w:rPr>
+        <w:t xml:space="preserve"> </w:t>
+      </w:r>
+      <w:r>
+        <w:rPr>
+          <w:b/>
+          <w:bCs/>
+          <w:lang w:val="fr"/>
+        </w:rPr>
+        <w:t xml:space="preserve">TCP</w:t>
+      </w:r>
+      <w:r>
+        <w:rPr>
+          <w:lang w:val="fr"/>
+        </w:rPr>
+        <w:t xml:space="preserve"> </w:t>
+      </w:r>
+      <w:r>
+        <w:rPr>
+          <w:lang w:val="fr"/>
+        </w:rPr>
+        <w:t xml:space="preserve">vers un Raspberry Pi partagé — celui-ci agrège tout et relaie vers la tablette avec la bonne cible.</w:t>
+      </w:r>
+    </w:p>
+    <w:p>
+      <w:pPr>
+        <w:pStyle w:val="SourceCode"/>
+      </w:pPr>
+      <w:r>
+        <w:rPr>
+          <w:rStyle w:val="ExtensionTok"/>
+        </w:rPr>
+        <w:t xml:space="preserve">pip</w:t>
+      </w:r>
+      <w:r>
+        <w:rPr>
+          <w:rStyle w:val="NormalTok"/>
+        </w:rPr>
+        <w:t xml:space="preserve"> install </w:t>
+      </w:r>
+      <w:r>
+        <w:rPr>
+          <w:rStyle w:val="AttributeTok"/>
+        </w:rPr>
+        <w:t xml:space="preserve">-r</w:t>
+      </w:r>
+      <w:r>
+        <w:rPr>
+          <w:rStyle w:val="NormalTok"/>
+        </w:rPr>
+        <w:t xml:space="preserve"> requirements-tcp-bridge.txt   </w:t>
+      </w:r>
+      <w:r>
+        <w:rPr>
+          <w:rStyle w:val="CommentTok"/>
+        </w:rPr>
+        <w:t xml:space="preserve"># Pillow, pour décoder les images</w:t>
+      </w:r>
+      <w:r>
+        <w:br/>
+      </w:r>
+      <w:r>
+        <w:rPr>
+          <w:rStyle w:val="ExtensionTok"/>
+        </w:rPr>
+        <w:t xml:space="preserve">python</w:t>
+      </w:r>
+      <w:r>
+        <w:rPr>
+          <w:rStyle w:val="NormalTok"/>
+        </w:rPr>
+        <w:t xml:space="preserve"> tcp_bridge.py</w:t>
+      </w:r>
+    </w:p>
+    <w:p>
+      <w:pPr>
+        <w:pStyle w:val="FirstParagraph"/>
+      </w:pPr>
+      <w:r>
+        <w:rPr>
+          <w:b/>
+          <w:bCs/>
+          <w:lang w:val="fr"/>
+        </w:rPr>
+        <w:t xml:space="preserve">IP fixe de ce Raspberry Pi :</w:t>
+      </w:r>
+      <w:r>
+        <w:rPr>
+          <w:b/>
+          <w:bCs/>
+          <w:lang w:val="fr"/>
+        </w:rPr>
+        <w:t xml:space="preserve"> </w:t>
+      </w:r>
+      <w:r>
+        <w:rPr>
+          <w:rStyle w:val="VerbatimChar"/>
+          <w:b/>
+          <w:bCs/>
+          <w:lang w:val="fr"/>
+        </w:rPr>
+        <w:t xml:space="preserve">192.168.0.255</w:t>
+      </w:r>
+      <w:r>
+        <w:rPr>
+          <w:lang w:val="fr"/>
+        </w:rPr>
+        <w:t xml:space="preserve"> </w:t>
+      </w:r>
+      <w:r>
+        <w:rPr>
+          <w:lang w:val="fr"/>
+        </w:rPr>
+        <w:t xml:space="preserve">— c’est l’adresse que les boîtiers de contrôle doivent viser. À fixer côté système d’exploitation du RPi (</w:t>
+      </w:r>
+      <w:r>
+        <w:rPr>
+          <w:rStyle w:val="VerbatimChar"/>
+          <w:lang w:val="fr"/>
+        </w:rPr>
+        <w:t xml:space="preserve">/etc/dhcpcd.conf</w:t>
+      </w:r>
+      <w:r>
+        <w:rPr>
+          <w:lang w:val="fr"/>
+        </w:rPr>
+        <w:t xml:space="preserve">, voir</w:t>
+      </w:r>
+      <w:r>
+        <w:rPr>
+          <w:lang w:val="fr"/>
+        </w:rPr>
+        <w:t xml:space="preserve"> </w:t>
+      </w:r>
+      <w:r>
+        <w:rPr>
+          <w:rStyle w:val="VerbatimChar"/>
+          <w:lang w:val="fr"/>
+        </w:rPr>
+        <w:t xml:space="preserve">rpi_sender/README.md</w:t>
+      </w:r>
+      <w:r>
+        <w:rPr>
+          <w:lang w:val="fr"/>
+        </w:rPr>
+        <w:t xml:space="preserve"> </w:t>
+      </w:r>
+      <w:r>
+        <w:rPr>
+          <w:lang w:val="fr"/>
+        </w:rPr>
+        <w:t xml:space="preserve">pour la procédure complète), pas dans la configuration Python.</w:t>
+      </w:r>
+    </w:p>
     <w:p>
       <w:pPr>
         <w:pStyle w:val="BodyText"/>
       </w:pPr>
       <w:r>
         <w:rPr>
-          <w:lang w:val="fr"/>
-        </w:rPr>
-        <w:t xml:space="preserve">Pour un fonctionnement autonome au démarrage du Raspberry Pi, ajouter ce script à un service</w:t>
+          <w:b/>
+          <w:bCs/>
+          <w:lang w:val="fr"/>
+        </w:rPr>
+        <w:t xml:space="preserve">Protocole confirmé avec le technicien</w:t>
+      </w:r>
+      <w:r>
+        <w:rPr>
+          <w:lang w:val="fr"/>
+        </w:rPr>
+        <w:t xml:space="preserve"> </w:t>
+      </w:r>
+      <w:r>
+        <w:rPr>
+          <w:lang w:val="fr"/>
+        </w:rPr>
+        <w:t xml:space="preserve">:</w:t>
+      </w:r>
+      <w:r>
+        <w:rPr>
+          <w:lang w:val="fr"/>
+        </w:rPr>
+        <w:t xml:space="preserve"> </w:t>
+      </w:r>
+      <w:r>
+        <w:rPr>
+          <w:lang w:val="fr"/>
+        </w:rPr>
+        <w:t xml:space="preserve">- TCP, port</w:t>
+      </w:r>
+      <w:r>
+        <w:rPr>
+          <w:lang w:val="fr"/>
+        </w:rPr>
+        <w:t xml:space="preserve"> </w:t>
+      </w:r>
+      <w:r>
+        <w:rPr>
+          <w:b/>
+          <w:bCs/>
+          <w:lang w:val="fr"/>
+        </w:rPr>
+        <w:t xml:space="preserve">9090</w:t>
+      </w:r>
+      <w:r>
+        <w:rPr>
+          <w:lang w:val="fr"/>
+        </w:rPr>
+        <w:t xml:space="preserve">.</w:t>
+      </w:r>
+      <w:r>
+        <w:rPr>
+          <w:lang w:val="fr"/>
+        </w:rPr>
+        <w:t xml:space="preserve"> </w:t>
+      </w:r>
+      <w:r>
+        <w:rPr>
+          <w:lang w:val="fr"/>
+        </w:rPr>
+        <w:t xml:space="preserve">- Une connexion transporte</w:t>
+      </w:r>
+      <w:r>
+        <w:rPr>
+          <w:lang w:val="fr"/>
+        </w:rPr>
+        <w:t xml:space="preserve"> </w:t>
+      </w:r>
+      <w:r>
+        <w:rPr>
+          <w:b/>
+          <w:bCs/>
+          <w:lang w:val="fr"/>
+        </w:rPr>
+        <w:t xml:space="preserve">plusieurs messages</w:t>
+      </w:r>
+      <w:r>
+        <w:rPr>
+          <w:lang w:val="fr"/>
+        </w:rPr>
+        <w:t xml:space="preserve"> </w:t>
+      </w:r>
+      <w:r>
+        <w:rPr>
+          <w:lang w:val="fr"/>
+        </w:rPr>
+        <w:t xml:space="preserve">à la suite (le boîtier ne se reconnecte pas à chaque forme d’onde) — chaque message est précédé d’un en-tête de 4 octets indiquant sa longueur, puisque les messages sont de taille variable.</w:t>
+      </w:r>
+      <w:r>
+        <w:rPr>
+          <w:lang w:val="fr"/>
+        </w:rPr>
+        <w:t xml:space="preserve"> </w:t>
+      </w:r>
+      <w:r>
+        <w:rPr>
+          <w:lang w:val="fr"/>
+        </w:rPr>
+        <w:t xml:space="preserve">- Chaque capteur est identifié par son</w:t>
+      </w:r>
+      <w:r>
+        <w:rPr>
+          <w:lang w:val="fr"/>
+        </w:rPr>
+        <w:t xml:space="preserve"> </w:t>
+      </w:r>
+      <w:r>
+        <w:rPr>
+          <w:b/>
+          <w:bCs/>
+          <w:lang w:val="fr"/>
+        </w:rPr>
+        <w:t xml:space="preserve">IP source</w:t>
+      </w:r>
+      <w:r>
+        <w:rPr>
+          <w:lang w:val="fr"/>
+        </w:rPr>
+        <w:t xml:space="preserve"> </w:t>
+      </w:r>
+      <w:r>
+        <w:rPr>
+          <w:lang w:val="fr"/>
+        </w:rPr>
+        <w:t xml:space="preserve">(table</w:t>
+      </w:r>
+      <w:r>
+        <w:rPr>
+          <w:lang w:val="fr"/>
+        </w:rPr>
+        <w:t xml:space="preserve"> </w:t>
+      </w:r>
+      <w:r>
+        <w:rPr>
+          <w:rStyle w:val="VerbatimChar"/>
+          <w:lang w:val="fr"/>
+        </w:rPr>
+        <w:t xml:space="preserve">ip_to_target</w:t>
+      </w:r>
+      <w:r>
+        <w:rPr>
+          <w:lang w:val="fr"/>
+        </w:rPr>
+        <w:t xml:space="preserve"> </w:t>
+      </w:r>
+      <w:r>
+        <w:rPr>
+          <w:lang w:val="fr"/>
+        </w:rPr>
+        <w:t xml:space="preserve">dans</w:t>
+      </w:r>
+      <w:r>
+        <w:rPr>
+          <w:lang w:val="fr"/>
+        </w:rPr>
+        <w:t xml:space="preserve"> </w:t>
+      </w:r>
+      <w:r>
+        <w:rPr>
+          <w:rStyle w:val="VerbatimChar"/>
+          <w:lang w:val="fr"/>
+        </w:rPr>
+        <w:t xml:space="preserve">rpi_sender/instance/tcp_bridge_config.json</w:t>
+      </w:r>
+      <w:r>
+        <w:rPr>
+          <w:lang w:val="fr"/>
+        </w:rPr>
+        <w:t xml:space="preserve">), cohérent avec le fait que chaque boîtier a sa propre IP fixe.</w:t>
+      </w:r>
+      <w:r>
+        <w:rPr>
+          <w:lang w:val="fr"/>
+        </w:rPr>
+        <w:t xml:space="preserve"> </w:t>
+      </w:r>
+      <w:r>
+        <w:rPr>
+          <w:lang w:val="fr"/>
+        </w:rPr>
+        <w:t xml:space="preserve">- Chaque message peut contenir soit 512 octets bruts, soit une</w:t>
+      </w:r>
+      <w:r>
+        <w:rPr>
+          <w:lang w:val="fr"/>
+        </w:rPr>
+        <w:t xml:space="preserve"> </w:t>
+      </w:r>
+      <w:r>
+        <w:rPr>
+          <w:b/>
+          <w:bCs/>
+          <w:lang w:val="fr"/>
+        </w:rPr>
+        <w:t xml:space="preserve">image</w:t>
+      </w:r>
+      <w:r>
+        <w:rPr>
+          <w:lang w:val="fr"/>
+        </w:rPr>
+        <w:t xml:space="preserve"> </w:t>
+      </w:r>
+      <w:r>
+        <w:rPr>
+          <w:lang w:val="fr"/>
+        </w:rPr>
+        <w:t xml:space="preserve">de la forme d’onde — détecté et digitalisé automatiquement (</w:t>
+      </w:r>
+      <w:r>
+        <w:rPr>
+          <w:rStyle w:val="VerbatimChar"/>
+          <w:lang w:val="fr"/>
+        </w:rPr>
+        <w:t xml:space="preserve">image_digitize.py</w:t>
+      </w:r>
+      <w:r>
+        <w:rPr>
+          <w:lang w:val="fr"/>
+        </w:rPr>
+        <w:t xml:space="preserve">, même méthode que l’import d’image de l’app terrain, section 10.5).</w:t>
+      </w:r>
+    </w:p>
+    <w:p>
+      <w:pPr>
+        <w:pStyle w:val="BodyText"/>
+      </w:pPr>
+      <w:r>
+        <w:rPr>
+          <w:lang w:val="fr"/>
+        </w:rPr>
+        <w:t xml:space="preserve">Validé de bout en bout : plusieurs formes d’onde (mélange brut/image) envoyées sur une même connexion TCP, toutes reçues, décodées et attribuées à la bonne cible côté tablette.</w:t>
+      </w:r>
+    </w:p>
+    <w:p>
+      <w:pPr>
+        <w:pStyle w:val="BodyText"/>
+      </w:pPr>
+      <w:r>
+        <w:rPr>
+          <w:lang w:val="fr"/>
+        </w:rPr>
+        <w:t xml:space="preserve">Pour un fonctionnement autonome au démarrage du Raspberry Pi, ajouter le script utilisé à un service</w:t>
       </w:r>
       <w:r>
         <w:rPr>
@@ -6264,8 +6756,9 @@
         </w:pict>
       </w:r>
     </w:p>
-    <w:bookmarkEnd w:id="47"/>
-    <w:bookmarkStart w:id="48" w:name="cicd"/>
+    <w:bookmarkEnd w:id="48"/>
+    <w:bookmarkEnd w:id="49"/>
+    <w:bookmarkStart w:id="50" w:name="cicd"/>
     <w:p>
       <w:pPr>
         <w:pStyle w:val="Heading1"/>
@@ -6482,8 +6975,8 @@
         </w:pict>
       </w:r>
     </w:p>
-    <w:bookmarkEnd w:id="48"/>
-    <w:bookmarkStart w:id="49" w:name="structure-du-dépôt"/>
+    <w:bookmarkEnd w:id="50"/>
+    <w:bookmarkStart w:id="51" w:name="structure-du-dépôt"/>
     <w:p>
       <w:pPr>
         <w:pStyle w:val="Heading1"/>
@@ -6804,8 +7297,8 @@
         </w:pict>
       </w:r>
     </w:p>
-    <w:bookmarkEnd w:id="49"/>
-    <w:bookmarkStart w:id="50" w:name="X62e6bc93baf43c8cd11e4a8f8aab6a98c1a1736"/>
+    <w:bookmarkEnd w:id="51"/>
+    <w:bookmarkStart w:id="52" w:name="X62e6bc93baf43c8cd11e4a8f8aab6a98c1a1736"/>
     <w:p>
       <w:pPr>
         <w:pStyle w:val="Heading1"/>
@@ -7020,8 +7513,8 @@
         </w:pict>
       </w:r>
     </w:p>
-    <w:bookmarkEnd w:id="50"/>
-    <w:bookmarkStart w:id="51" w:name="limites-connues-du-projet"/>
+    <w:bookmarkEnd w:id="52"/>
+    <w:bookmarkStart w:id="53" w:name="limites-connues-du-projet"/>
     <w:p>
       <w:pPr>
         <w:pStyle w:val="Heading1"/>
@@ -7174,8 +7667,8 @@
         </w:pict>
       </w:r>
     </w:p>
-    <w:bookmarkEnd w:id="51"/>
-    <w:bookmarkStart w:id="52" w:name="X90cf48057834cc906ee2d5cd74c83d530c98f98"/>
+    <w:bookmarkEnd w:id="53"/>
+    <w:bookmarkStart w:id="54" w:name="X90cf48057834cc906ee2d5cd74c83d530c98f98"/>
     <w:p>
       <w:pPr>
         <w:pStyle w:val="Heading1"/>
@@ -7635,14 +8128,163 @@
       </w:r>
     </w:p>
     <w:p>
+      <w:pPr>
+        <w:pStyle w:val="Compact"/>
+        <w:numPr>
+          <w:ilvl w:val="0"/>
+          <w:numId w:val="1011"/>
+        </w:numPr>
+      </w:pPr>
+      <w:r>
+        <w:rPr>
+          <w:b/>
+          <w:bCs/>
+          <w:lang w:val="fr"/>
+        </w:rPr>
+        <w:t xml:space="preserve">Conteneur agent</w:t>
+      </w:r>
+      <w:r>
+        <w:rPr>
+          <w:b/>
+          <w:bCs/>
+          <w:lang w:val="fr"/>
+        </w:rPr>
+        <w:t xml:space="preserve"> </w:t>
+      </w:r>
+      <w:r>
+        <w:rPr>
+          <w:b/>
+          <w:bCs/>
+          <w:lang w:val="fr"/>
+        </w:rPr>
+        <w:t xml:space="preserve">“unhealthy”</w:t>
+      </w:r>
+      <w:r>
+        <w:rPr>
+          <w:b/>
+          <w:bCs/>
+          <w:lang w:val="fr"/>
+        </w:rPr>
+        <w:t xml:space="preserve"> </w:t>
+      </w:r>
+      <w:r>
+        <w:rPr>
+          <w:b/>
+          <w:bCs/>
+          <w:lang w:val="fr"/>
+        </w:rPr>
+        <w:t xml:space="preserve">à tort</w:t>
+      </w:r>
+      <w:r>
+        <w:rPr>
+          <w:lang w:val="fr"/>
+        </w:rPr>
+        <w:t xml:space="preserve"> </w:t>
+      </w:r>
+      <w:r>
+        <w:rPr>
+          <w:lang w:val="fr"/>
+        </w:rPr>
+        <w:t xml:space="preserve">— l’agent (</w:t>
+      </w:r>
+      <w:r>
+        <w:rPr>
+          <w:rStyle w:val="VerbatimChar"/>
+          <w:lang w:val="fr"/>
+        </w:rPr>
+        <w:t xml:space="preserve">docker-compose.yml</w:t>
+      </w:r>
+      <w:r>
+        <w:rPr>
+          <w:lang w:val="fr"/>
+        </w:rPr>
+        <w:t xml:space="preserve">) héritait du</w:t>
+      </w:r>
+      <w:r>
+        <w:rPr>
+          <w:lang w:val="fr"/>
+        </w:rPr>
+        <w:t xml:space="preserve"> </w:t>
+      </w:r>
+      <w:r>
+        <w:rPr>
+          <w:rStyle w:val="VerbatimChar"/>
+          <w:lang w:val="fr"/>
+        </w:rPr>
+        <w:t xml:space="preserve">HEALTHCHECK</w:t>
+      </w:r>
+      <w:r>
+        <w:rPr>
+          <w:lang w:val="fr"/>
+        </w:rPr>
+        <w:t xml:space="preserve"> </w:t>
+      </w:r>
+      <w:r>
+        <w:rPr>
+          <w:lang w:val="fr"/>
+        </w:rPr>
+        <w:t xml:space="preserve">du Dockerfile qui vérifie le port 8501 (Streamlit), qu’il ne sert pas — il s’affichait</w:t>
+      </w:r>
+      <w:r>
+        <w:rPr>
+          <w:lang w:val="fr"/>
+        </w:rPr>
+        <w:t xml:space="preserve"> </w:t>
+      </w:r>
+      <w:r>
+        <w:rPr>
+          <w:rStyle w:val="VerbatimChar"/>
+          <w:lang w:val="fr"/>
+        </w:rPr>
+        <w:t xml:space="preserve">unhealthy</w:t>
+      </w:r>
+      <w:r>
+        <w:rPr>
+          <w:lang w:val="fr"/>
+        </w:rPr>
+        <w:t xml:space="preserve"> </w:t>
+      </w:r>
+      <w:r>
+        <w:rPr>
+          <w:lang w:val="fr"/>
+        </w:rPr>
+        <w:t xml:space="preserve">en continu depuis son démarrage bien qu’il fonctionne normalement. Corrigé en ajoutant un healthcheck dédié sur son propre</w:t>
+      </w:r>
+      <w:r>
+        <w:rPr>
+          <w:lang w:val="fr"/>
+        </w:rPr>
+        <w:t xml:space="preserve"> </w:t>
+      </w:r>
+      <w:r>
+        <w:rPr>
+          <w:rStyle w:val="VerbatimChar"/>
+          <w:lang w:val="fr"/>
+        </w:rPr>
+        <w:t xml:space="preserve">/metrics</w:t>
+      </w:r>
+      <w:r>
+        <w:rPr>
+          <w:lang w:val="fr"/>
+        </w:rPr>
+        <w:t xml:space="preserve"> </w:t>
+      </w:r>
+      <w:r>
+        <w:rPr>
+          <w:lang w:val="fr"/>
+        </w:rPr>
+        <w:t xml:space="preserve">(port 8001).</w:t>
+      </w:r>
+    </w:p>
+    <w:p>
       <w:r>
         <w:pict>
           <v:rect style="width:0;height:1.5pt" o:hralign="center" o:hrstd="t" o:hr="t"/>
         </w:pict>
       </w:r>
     </w:p>
-    <w:bookmarkEnd w:id="52"/>
-    <w:bookmarkStart w:id="55" w:name="référence-rapide-commandes-et-ports"/>
+    <w:bookmarkEnd w:id="54"/>
+    <w:bookmarkStart w:id="57" w:name="référence-rapide-commandes-et-ports"/>
     <w:p>
       <w:pPr>
         <w:pStyle w:val="Heading1"/>
@@ -7654,7 +8296,7 @@
         <w:t xml:space="preserve">17. Référence rapide — commandes et ports</w:t>
       </w:r>
     </w:p>
-    <w:bookmarkStart w:id="53" w:name="commandes-essentielles"/>
+    <w:bookmarkStart w:id="55" w:name="commandes-essentielles"/>
     <w:p>
       <w:pPr>
         <w:pStyle w:val="Heading2"/>
@@ -7863,8 +8505,8 @@
         <w:t xml:space="preserve"># un cycle d'agent manuel</w:t>
       </w:r>
     </w:p>
-    <w:bookmarkEnd w:id="53"/>
-    <w:bookmarkStart w:id="54" w:name="ports-utilisés"/>
+    <w:bookmarkEnd w:id="55"/>
+    <w:bookmarkStart w:id="56" w:name="ports-utilisés"/>
     <w:p>
       <w:pPr>
         <w:pStyle w:val="Heading2"/>
@@ -8173,8 +8815,8 @@
         <w:t xml:space="preserve">.</w:t>
       </w:r>
     </w:p>
-    <w:bookmarkEnd w:id="54"/>
-    <w:bookmarkEnd w:id="55"/>
+    <w:bookmarkEnd w:id="56"/>
+    <w:bookmarkEnd w:id="57"/>
     <w:sectPr>
       <w:footnotePr>
         <w:numRestart w:val="eachSect"/>

</xml_diff>